<commit_message>
docs: update progress table with actual metrics and rebuild docx
- Progress table: updated all 9 weeks with honest status
  (SORT 80%, OCR eval 60%, Dashboard 80%, rest done)
- Added test log references and last-update timestamp
- Rebuilt bao-cao.docx with updated content (2.3MB, 11 images)
</commit_message>
<xml_diff>
--- a/reports/2026-04-13/docx/bao-cao.docx
+++ b/reports/2026-04-13/docx/bao-cao.docx
@@ -599,7 +599,7 @@
                 <w:sz w:val="22"/>
                 <w:szCs w:val="22"/>
               </w:rPr>
-              <w:t xml:space="preserve">Đề cương đã</w:t>
+              <w:t xml:space="preserve">Đề cương được duyệt</w:t>
             </w:r>
           </w:p>
         </w:tc>
@@ -630,7 +630,7 @@
                 <w:sz w:val="22"/>
                 <w:szCs w:val="22"/>
               </w:rPr>
-              <w:t xml:space="preserve"/>
+              <w:t xml:space="preserve">3-4</w:t>
             </w:r>
           </w:p>
         </w:tc>
@@ -656,7 +656,7 @@
                 <w:sz w:val="22"/>
                 <w:szCs w:val="22"/>
               </w:rPr>
-              <w:t xml:space="preserve"/>
+              <w:t xml:space="preserve">Chuẩn bị dữ liệu, baseline detect</w:t>
             </w:r>
           </w:p>
         </w:tc>
@@ -682,7 +682,7 @@
                 <w:sz w:val="22"/>
                 <w:szCs w:val="22"/>
               </w:rPr>
-              <w:t xml:space="preserve"/>
+              <w:t xml:space="preserve">✅ Xong</w:t>
             </w:r>
           </w:p>
         </w:tc>
@@ -708,7 +708,7 @@
                 <w:sz w:val="22"/>
                 <w:szCs w:val="22"/>
               </w:rPr>
-              <w:t xml:space="preserve">được duyệt</w:t>
+              <w:t xml:space="preserve">VNLP 37,297 ảnh</w:t>
             </w:r>
           </w:p>
         </w:tc>
@@ -739,7 +739,7 @@
                 <w:sz w:val="22"/>
                 <w:szCs w:val="22"/>
               </w:rPr>
-              <w:t xml:space="preserve">3-4</w:t>
+              <w:t xml:space="preserve"/>
             </w:r>
           </w:p>
         </w:tc>
@@ -765,7 +765,7 @@
                 <w:sz w:val="22"/>
                 <w:szCs w:val="22"/>
               </w:rPr>
-              <w:t xml:space="preserve">Chuẩn bị dữ liệu, baseline detect</w:t>
+              <w:t xml:space="preserve"/>
             </w:r>
           </w:p>
         </w:tc>
@@ -791,7 +791,7 @@
                 <w:sz w:val="22"/>
                 <w:szCs w:val="22"/>
               </w:rPr>
-              <w:t xml:space="preserve">✅ Xong</w:t>
+              <w:t xml:space="preserve"/>
             </w:r>
           </w:p>
         </w:tc>
@@ -817,7 +817,7 @@
                 <w:sz w:val="22"/>
                 <w:szCs w:val="22"/>
               </w:rPr>
-              <w:t xml:space="preserve">VNLP 37,297</w:t>
+              <w:t xml:space="preserve">4 pretrained models</w:t>
             </w:r>
           </w:p>
         </w:tc>
@@ -848,7 +848,7 @@
                 <w:sz w:val="22"/>
                 <w:szCs w:val="22"/>
               </w:rPr>
-              <w:t xml:space="preserve"/>
+              <w:t xml:space="preserve">5-6</w:t>
             </w:r>
           </w:p>
         </w:tc>
@@ -874,7 +874,7 @@
                 <w:sz w:val="22"/>
                 <w:szCs w:val="22"/>
               </w:rPr>
-              <w:t xml:space="preserve"/>
+              <w:t xml:space="preserve">Tracking, đếm xe</w:t>
             </w:r>
           </w:p>
         </w:tc>
@@ -900,7 +900,7 @@
                 <w:sz w:val="22"/>
                 <w:szCs w:val="22"/>
               </w:rPr>
-              <w:t xml:space="preserve"/>
+              <w:t xml:space="preserve">⚠ 80%</w:t>
             </w:r>
           </w:p>
         </w:tc>
@@ -926,7 +926,7 @@
                 <w:sz w:val="22"/>
                 <w:szCs w:val="22"/>
               </w:rPr>
-              <w:t xml:space="preserve">ảnh + models</w:t>
+              <w:t xml:space="preserve">SORT tracker: xong</w:t>
             </w:r>
           </w:p>
         </w:tc>
@@ -957,7 +957,7 @@
                 <w:sz w:val="22"/>
                 <w:szCs w:val="22"/>
               </w:rPr>
-              <w:t xml:space="preserve">5-6</w:t>
+              <w:t xml:space="preserve"/>
             </w:r>
           </w:p>
         </w:tc>
@@ -983,7 +983,7 @@
                 <w:sz w:val="22"/>
                 <w:szCs w:val="22"/>
               </w:rPr>
-              <w:t xml:space="preserve">Tracking, luật đếm, đo sai số</w:t>
+              <w:t xml:space="preserve"/>
             </w:r>
           </w:p>
         </w:tc>
@@ -1009,7 +1009,7 @@
                 <w:sz w:val="22"/>
                 <w:szCs w:val="22"/>
               </w:rPr>
-              <w:t xml:space="preserve">⚠ 70%</w:t>
+              <w:t xml:space="preserve"/>
             </w:r>
           </w:p>
         </w:tc>
@@ -1035,7 +1035,7 @@
                 <w:sz w:val="22"/>
                 <w:szCs w:val="22"/>
               </w:rPr>
-              <w:t xml:space="preserve">Tracking OK</w:t>
+              <w:t xml:space="preserve">Đếm theo camera</w:t>
             </w:r>
           </w:p>
         </w:tc>
@@ -1144,7 +1144,7 @@
                 <w:sz w:val="22"/>
                 <w:szCs w:val="22"/>
               </w:rPr>
-              <w:t xml:space="preserve">Đếm: chưa</w:t>
+              <w:t xml:space="preserve">direction: dự kiến</w:t>
             </w:r>
           </w:p>
         </w:tc>
@@ -1253,7 +1253,7 @@
                 <w:sz w:val="22"/>
                 <w:szCs w:val="22"/>
               </w:rPr>
-              <w:t xml:space="preserve">OCR 2-row</w:t>
+              <w:t xml:space="preserve">LP_detector 100%</w:t>
             </w:r>
           </w:p>
         </w:tc>
@@ -1362,7 +1362,7 @@
                 <w:sz w:val="22"/>
                 <w:szCs w:val="22"/>
               </w:rPr>
-              <w:t xml:space="preserve">VN hoạt động</w:t>
+              <w:t xml:space="preserve">OCR 2-row VN: xong</w:t>
             </w:r>
           </w:p>
         </w:tc>
@@ -1445,7 +1445,7 @@
                 <w:sz w:val="22"/>
                 <w:szCs w:val="22"/>
               </w:rPr>
-              <w:t xml:space="preserve">⚠ 50%</w:t>
+              <w:t xml:space="preserve">⚠ 60%</w:t>
             </w:r>
           </w:p>
         </w:tc>
@@ -1471,7 +1471,7 @@
                 <w:sz w:val="22"/>
                 <w:szCs w:val="22"/>
               </w:rPr>
-              <w:t xml:space="preserve">Baseline có</w:t>
+              <w:t xml:space="preserve">Baseline 50 ảnh: có</w:t>
             </w:r>
           </w:p>
         </w:tc>
@@ -1580,7 +1580,7 @@
                 <w:sz w:val="22"/>
                 <w:szCs w:val="22"/>
               </w:rPr>
-              <w:t xml:space="preserve">chưa full</w:t>
+              <w:t xml:space="preserve">Full 3,731 ảnh: chưa</w:t>
             </w:r>
           </w:p>
         </w:tc>
@@ -1611,7 +1611,7 @@
                 <w:sz w:val="22"/>
                 <w:szCs w:val="22"/>
               </w:rPr>
-              <w:t xml:space="preserve">11-12</w:t>
+              <w:t xml:space="preserve"/>
             </w:r>
           </w:p>
         </w:tc>
@@ -1637,7 +1637,7 @@
                 <w:sz w:val="22"/>
                 <w:szCs w:val="22"/>
               </w:rPr>
-              <w:t xml:space="preserve">Backend, CSDL, API</w:t>
+              <w:t xml:space="preserve"/>
             </w:r>
           </w:p>
         </w:tc>
@@ -1663,7 +1663,7 @@
                 <w:sz w:val="22"/>
                 <w:szCs w:val="22"/>
               </w:rPr>
-              <w:t xml:space="preserve">✅ Xong</w:t>
+              <w:t xml:space="preserve"/>
             </w:r>
           </w:p>
         </w:tc>
@@ -1689,7 +1689,7 @@
                 <w:sz w:val="22"/>
                 <w:szCs w:val="22"/>
               </w:rPr>
-              <w:t xml:space="preserve">18 endpoints</w:t>
+              <w:t xml:space="preserve">Regex biển VN: chưa</w:t>
             </w:r>
           </w:p>
         </w:tc>
@@ -1720,7 +1720,7 @@
                 <w:sz w:val="22"/>
                 <w:szCs w:val="22"/>
               </w:rPr>
-              <w:t xml:space="preserve"/>
+              <w:t xml:space="preserve">11-12</w:t>
             </w:r>
           </w:p>
         </w:tc>
@@ -1746,7 +1746,7 @@
                 <w:sz w:val="22"/>
                 <w:szCs w:val="22"/>
               </w:rPr>
-              <w:t xml:space="preserve"/>
+              <w:t xml:space="preserve">Backend, CSDL, API</w:t>
             </w:r>
           </w:p>
         </w:tc>
@@ -1772,7 +1772,7 @@
                 <w:sz w:val="22"/>
                 <w:szCs w:val="22"/>
               </w:rPr>
-              <w:t xml:space="preserve"/>
+              <w:t xml:space="preserve">✅ Xong</w:t>
             </w:r>
           </w:p>
         </w:tc>
@@ -1798,7 +1798,7 @@
                 <w:sz w:val="22"/>
                 <w:szCs w:val="22"/>
               </w:rPr>
-              <w:t xml:space="preserve">10 bảng DB</w:t>
+              <w:t xml:space="preserve">18 endpoints, 10 DB</w:t>
             </w:r>
           </w:p>
         </w:tc>
@@ -1829,7 +1829,7 @@
                 <w:sz w:val="22"/>
                 <w:szCs w:val="22"/>
               </w:rPr>
-              <w:t xml:space="preserve">13-14</w:t>
+              <w:t xml:space="preserve"/>
             </w:r>
           </w:p>
         </w:tc>
@@ -1855,7 +1855,7 @@
                 <w:sz w:val="22"/>
                 <w:szCs w:val="22"/>
               </w:rPr>
-              <w:t xml:space="preserve">Dashboard realtime/thống kê</w:t>
+              <w:t xml:space="preserve"/>
             </w:r>
           </w:p>
         </w:tc>
@@ -1881,7 +1881,7 @@
                 <w:sz w:val="22"/>
                 <w:szCs w:val="22"/>
               </w:rPr>
-              <w:t xml:space="preserve">✅ Xong</w:t>
+              <w:t xml:space="preserve"/>
             </w:r>
           </w:p>
         </w:tc>
@@ -1907,7 +1907,7 @@
                 <w:sz w:val="22"/>
                 <w:szCs w:val="22"/>
               </w:rPr>
-              <w:t xml:space="preserve">React + TS</w:t>
+              <w:t xml:space="preserve">56/56 tests pass</w:t>
             </w:r>
           </w:p>
         </w:tc>
@@ -1938,7 +1938,7 @@
                 <w:sz w:val="22"/>
                 <w:szCs w:val="22"/>
               </w:rPr>
-              <w:t xml:space="preserve">15</w:t>
+              <w:t xml:space="preserve">13-14</w:t>
             </w:r>
           </w:p>
         </w:tc>
@@ -1964,7 +1964,7 @@
                 <w:sz w:val="22"/>
                 <w:szCs w:val="22"/>
               </w:rPr>
-              <w:t xml:space="preserve">Tích hợp, tối ưu, kiểm thử</w:t>
+              <w:t xml:space="preserve">Dashboard realtime/thống kê</w:t>
             </w:r>
           </w:p>
         </w:tc>
@@ -1990,7 +1990,7 @@
                 <w:sz w:val="22"/>
                 <w:szCs w:val="22"/>
               </w:rPr>
-              <w:t xml:space="preserve">✅ Xong</w:t>
+              <w:t xml:space="preserve">⚠ 80%</w:t>
             </w:r>
           </w:p>
         </w:tc>
@@ -2016,7 +2016,7 @@
                 <w:sz w:val="22"/>
                 <w:szCs w:val="22"/>
               </w:rPr>
-              <w:t xml:space="preserve">E2E demo</w:t>
+              <w:t xml:space="preserve">Events list: OK</w:t>
             </w:r>
           </w:p>
         </w:tc>
@@ -2125,7 +2125,7 @@
                 <w:sz w:val="22"/>
                 <w:szCs w:val="22"/>
               </w:rPr>
-              <w:t xml:space="preserve">hoạt động</w:t>
+              <w:t xml:space="preserve">Các mục khác: chưa</w:t>
             </w:r>
           </w:p>
         </w:tc>
@@ -2156,6 +2156,333 @@
                 <w:sz w:val="22"/>
                 <w:szCs w:val="22"/>
               </w:rPr>
+              <w:t xml:space="preserve"/>
+            </w:r>
+          </w:p>
+        </w:tc>
+        <w:tc>
+          <w:tcPr>
+            <w:tcW w:type="dxa" w:w="2340"/>
+            <w:tcBorders>
+              <w:top w:val="single" w:color="999999" w:sz="1"/>
+              <w:left w:val="single" w:color="999999" w:sz="1"/>
+              <w:bottom w:val="single" w:color="999999" w:sz="1"/>
+              <w:right w:val="single" w:color="999999" w:sz="1"/>
+            </w:tcBorders>
+          </w:tcPr>
+          <w:p>
+            <w:pPr>
+              <w:spacing w:after="40" w:before="40"/>
+            </w:pPr>
+            <w:r>
+              <w:rPr>
+                <w:rFonts w:ascii="Times New Roman" w:cs="Times New Roman" w:eastAsia="Times New Roman" w:hAnsi="Times New Roman"/>
+                <w:b w:val="false"/>
+                <w:bCs w:val="false"/>
+                <w:sz w:val="22"/>
+                <w:szCs w:val="22"/>
+              </w:rPr>
+              <w:t xml:space="preserve"/>
+            </w:r>
+          </w:p>
+        </w:tc>
+        <w:tc>
+          <w:tcPr>
+            <w:tcW w:type="dxa" w:w="2340"/>
+            <w:tcBorders>
+              <w:top w:val="single" w:color="999999" w:sz="1"/>
+              <w:left w:val="single" w:color="999999" w:sz="1"/>
+              <w:bottom w:val="single" w:color="999999" w:sz="1"/>
+              <w:right w:val="single" w:color="999999" w:sz="1"/>
+            </w:tcBorders>
+          </w:tcPr>
+          <w:p>
+            <w:pPr>
+              <w:spacing w:after="40" w:before="40"/>
+            </w:pPr>
+            <w:r>
+              <w:rPr>
+                <w:rFonts w:ascii="Times New Roman" w:cs="Times New Roman" w:eastAsia="Times New Roman" w:hAnsi="Times New Roman"/>
+                <w:b w:val="false"/>
+                <w:bCs w:val="false"/>
+                <w:sz w:val="22"/>
+                <w:szCs w:val="22"/>
+              </w:rPr>
+              <w:t xml:space="preserve"/>
+            </w:r>
+          </w:p>
+        </w:tc>
+        <w:tc>
+          <w:tcPr>
+            <w:tcW w:type="dxa" w:w="2340"/>
+            <w:tcBorders>
+              <w:top w:val="single" w:color="999999" w:sz="1"/>
+              <w:left w:val="single" w:color="999999" w:sz="1"/>
+              <w:bottom w:val="single" w:color="999999" w:sz="1"/>
+              <w:right w:val="single" w:color="999999" w:sz="1"/>
+            </w:tcBorders>
+          </w:tcPr>
+          <w:p>
+            <w:pPr>
+              <w:spacing w:after="40" w:before="40"/>
+            </w:pPr>
+            <w:r>
+              <w:rPr>
+                <w:rFonts w:ascii="Times New Roman" w:cs="Times New Roman" w:eastAsia="Times New Roman" w:hAnsi="Times New Roman"/>
+                <w:b w:val="false"/>
+                <w:bCs w:val="false"/>
+                <w:sz w:val="22"/>
+                <w:szCs w:val="22"/>
+              </w:rPr>
+              <w:t xml:space="preserve">test kỹ trên browser</w:t>
+            </w:r>
+          </w:p>
+        </w:tc>
+      </w:tr>
+      <w:tr>
+        <w:trPr>
+          <w:tblHeader w:val="false"/>
+        </w:trPr>
+        <w:tc>
+          <w:tcPr>
+            <w:tcW w:type="dxa" w:w="2340"/>
+            <w:tcBorders>
+              <w:top w:val="single" w:color="999999" w:sz="1"/>
+              <w:left w:val="single" w:color="999999" w:sz="1"/>
+              <w:bottom w:val="single" w:color="999999" w:sz="1"/>
+              <w:right w:val="single" w:color="999999" w:sz="1"/>
+            </w:tcBorders>
+          </w:tcPr>
+          <w:p>
+            <w:pPr>
+              <w:spacing w:after="40" w:before="40"/>
+            </w:pPr>
+            <w:r>
+              <w:rPr>
+                <w:rFonts w:ascii="Times New Roman" w:cs="Times New Roman" w:eastAsia="Times New Roman" w:hAnsi="Times New Roman"/>
+                <w:b w:val="false"/>
+                <w:bCs w:val="false"/>
+                <w:sz w:val="22"/>
+                <w:szCs w:val="22"/>
+              </w:rPr>
+              <w:t xml:space="preserve">15</w:t>
+            </w:r>
+          </w:p>
+        </w:tc>
+        <w:tc>
+          <w:tcPr>
+            <w:tcW w:type="dxa" w:w="2340"/>
+            <w:tcBorders>
+              <w:top w:val="single" w:color="999999" w:sz="1"/>
+              <w:left w:val="single" w:color="999999" w:sz="1"/>
+              <w:bottom w:val="single" w:color="999999" w:sz="1"/>
+              <w:right w:val="single" w:color="999999" w:sz="1"/>
+            </w:tcBorders>
+          </w:tcPr>
+          <w:p>
+            <w:pPr>
+              <w:spacing w:after="40" w:before="40"/>
+            </w:pPr>
+            <w:r>
+              <w:rPr>
+                <w:rFonts w:ascii="Times New Roman" w:cs="Times New Roman" w:eastAsia="Times New Roman" w:hAnsi="Times New Roman"/>
+                <w:b w:val="false"/>
+                <w:bCs w:val="false"/>
+                <w:sz w:val="22"/>
+                <w:szCs w:val="22"/>
+              </w:rPr>
+              <w:t xml:space="preserve">Tích hợp, tối ưu, kiểm thử</w:t>
+            </w:r>
+          </w:p>
+        </w:tc>
+        <w:tc>
+          <w:tcPr>
+            <w:tcW w:type="dxa" w:w="2340"/>
+            <w:tcBorders>
+              <w:top w:val="single" w:color="999999" w:sz="1"/>
+              <w:left w:val="single" w:color="999999" w:sz="1"/>
+              <w:bottom w:val="single" w:color="999999" w:sz="1"/>
+              <w:right w:val="single" w:color="999999" w:sz="1"/>
+            </w:tcBorders>
+          </w:tcPr>
+          <w:p>
+            <w:pPr>
+              <w:spacing w:after="40" w:before="40"/>
+            </w:pPr>
+            <w:r>
+              <w:rPr>
+                <w:rFonts w:ascii="Times New Roman" w:cs="Times New Roman" w:eastAsia="Times New Roman" w:hAnsi="Times New Roman"/>
+                <w:b w:val="false"/>
+                <w:bCs w:val="false"/>
+                <w:sz w:val="22"/>
+                <w:szCs w:val="22"/>
+              </w:rPr>
+              <w:t xml:space="preserve">✅ Xong</w:t>
+            </w:r>
+          </w:p>
+        </w:tc>
+        <w:tc>
+          <w:tcPr>
+            <w:tcW w:type="dxa" w:w="2340"/>
+            <w:tcBorders>
+              <w:top w:val="single" w:color="999999" w:sz="1"/>
+              <w:left w:val="single" w:color="999999" w:sz="1"/>
+              <w:bottom w:val="single" w:color="999999" w:sz="1"/>
+              <w:right w:val="single" w:color="999999" w:sz="1"/>
+            </w:tcBorders>
+          </w:tcPr>
+          <w:p>
+            <w:pPr>
+              <w:spacing w:after="40" w:before="40"/>
+            </w:pPr>
+            <w:r>
+              <w:rPr>
+                <w:rFonts w:ascii="Times New Roman" w:cs="Times New Roman" w:eastAsia="Times New Roman" w:hAnsi="Times New Roman"/>
+                <w:b w:val="false"/>
+                <w:bCs w:val="false"/>
+                <w:sz w:val="22"/>
+                <w:szCs w:val="22"/>
+              </w:rPr>
+              <w:t xml:space="preserve">E2E demo hoạt động</w:t>
+            </w:r>
+          </w:p>
+        </w:tc>
+      </w:tr>
+      <w:tr>
+        <w:trPr>
+          <w:tblHeader w:val="false"/>
+        </w:trPr>
+        <w:tc>
+          <w:tcPr>
+            <w:tcW w:type="dxa" w:w="2340"/>
+            <w:tcBorders>
+              <w:top w:val="single" w:color="999999" w:sz="1"/>
+              <w:left w:val="single" w:color="999999" w:sz="1"/>
+              <w:bottom w:val="single" w:color="999999" w:sz="1"/>
+              <w:right w:val="single" w:color="999999" w:sz="1"/>
+            </w:tcBorders>
+          </w:tcPr>
+          <w:p>
+            <w:pPr>
+              <w:spacing w:after="40" w:before="40"/>
+            </w:pPr>
+            <w:r>
+              <w:rPr>
+                <w:rFonts w:ascii="Times New Roman" w:cs="Times New Roman" w:eastAsia="Times New Roman" w:hAnsi="Times New Roman"/>
+                <w:b w:val="false"/>
+                <w:bCs w:val="false"/>
+                <w:sz w:val="22"/>
+                <w:szCs w:val="22"/>
+              </w:rPr>
+              <w:t xml:space="preserve"/>
+            </w:r>
+          </w:p>
+        </w:tc>
+        <w:tc>
+          <w:tcPr>
+            <w:tcW w:type="dxa" w:w="2340"/>
+            <w:tcBorders>
+              <w:top w:val="single" w:color="999999" w:sz="1"/>
+              <w:left w:val="single" w:color="999999" w:sz="1"/>
+              <w:bottom w:val="single" w:color="999999" w:sz="1"/>
+              <w:right w:val="single" w:color="999999" w:sz="1"/>
+            </w:tcBorders>
+          </w:tcPr>
+          <w:p>
+            <w:pPr>
+              <w:spacing w:after="40" w:before="40"/>
+            </w:pPr>
+            <w:r>
+              <w:rPr>
+                <w:rFonts w:ascii="Times New Roman" w:cs="Times New Roman" w:eastAsia="Times New Roman" w:hAnsi="Times New Roman"/>
+                <w:b w:val="false"/>
+                <w:bCs w:val="false"/>
+                <w:sz w:val="22"/>
+                <w:szCs w:val="22"/>
+              </w:rPr>
+              <w:t xml:space="preserve"/>
+            </w:r>
+          </w:p>
+        </w:tc>
+        <w:tc>
+          <w:tcPr>
+            <w:tcW w:type="dxa" w:w="2340"/>
+            <w:tcBorders>
+              <w:top w:val="single" w:color="999999" w:sz="1"/>
+              <w:left w:val="single" w:color="999999" w:sz="1"/>
+              <w:bottom w:val="single" w:color="999999" w:sz="1"/>
+              <w:right w:val="single" w:color="999999" w:sz="1"/>
+            </w:tcBorders>
+          </w:tcPr>
+          <w:p>
+            <w:pPr>
+              <w:spacing w:after="40" w:before="40"/>
+            </w:pPr>
+            <w:r>
+              <w:rPr>
+                <w:rFonts w:ascii="Times New Roman" w:cs="Times New Roman" w:eastAsia="Times New Roman" w:hAnsi="Times New Roman"/>
+                <w:b w:val="false"/>
+                <w:bCs w:val="false"/>
+                <w:sz w:val="22"/>
+                <w:szCs w:val="22"/>
+              </w:rPr>
+              <w:t xml:space="preserve"/>
+            </w:r>
+          </w:p>
+        </w:tc>
+        <w:tc>
+          <w:tcPr>
+            <w:tcW w:type="dxa" w:w="2340"/>
+            <w:tcBorders>
+              <w:top w:val="single" w:color="999999" w:sz="1"/>
+              <w:left w:val="single" w:color="999999" w:sz="1"/>
+              <w:bottom w:val="single" w:color="999999" w:sz="1"/>
+              <w:right w:val="single" w:color="999999" w:sz="1"/>
+            </w:tcBorders>
+          </w:tcPr>
+          <w:p>
+            <w:pPr>
+              <w:spacing w:after="40" w:before="40"/>
+            </w:pPr>
+            <w:r>
+              <w:rPr>
+                <w:rFonts w:ascii="Times New Roman" w:cs="Times New Roman" w:eastAsia="Times New Roman" w:hAnsi="Times New Roman"/>
+                <w:b w:val="false"/>
+                <w:bCs w:val="false"/>
+                <w:sz w:val="22"/>
+                <w:szCs w:val="22"/>
+              </w:rPr>
+              <w:t xml:space="preserve">Test 14/16 pass</w:t>
+            </w:r>
+          </w:p>
+        </w:tc>
+      </w:tr>
+      <w:tr>
+        <w:trPr>
+          <w:tblHeader w:val="false"/>
+        </w:trPr>
+        <w:tc>
+          <w:tcPr>
+            <w:tcW w:type="dxa" w:w="2340"/>
+            <w:tcBorders>
+              <w:top w:val="single" w:color="999999" w:sz="1"/>
+              <w:left w:val="single" w:color="999999" w:sz="1"/>
+              <w:bottom w:val="single" w:color="999999" w:sz="1"/>
+              <w:right w:val="single" w:color="999999" w:sz="1"/>
+            </w:tcBorders>
+          </w:tcPr>
+          <w:p>
+            <w:pPr>
+              <w:spacing w:after="40" w:before="40"/>
+            </w:pPr>
+            <w:r>
+              <w:rPr>
+                <w:rFonts w:ascii="Times New Roman" w:cs="Times New Roman" w:eastAsia="Times New Roman" w:hAnsi="Times New Roman"/>
+                <w:b w:val="false"/>
+                <w:bCs w:val="false"/>
+                <w:sz w:val="22"/>
+                <w:szCs w:val="22"/>
+              </w:rPr>
               <w:t xml:space="preserve">16</w:t>
             </w:r>
           </w:p>
@@ -2234,7 +2561,225 @@
                 <w:sz w:val="22"/>
                 <w:szCs w:val="22"/>
               </w:rPr>
-              <w:t xml:space="preserve">Báo cáo này</w:t>
+              <w:t xml:space="preserve">Báo cáo .md + .docx</w:t>
+            </w:r>
+          </w:p>
+        </w:tc>
+      </w:tr>
+      <w:tr>
+        <w:trPr>
+          <w:tblHeader w:val="false"/>
+        </w:trPr>
+        <w:tc>
+          <w:tcPr>
+            <w:tcW w:type="dxa" w:w="2340"/>
+            <w:tcBorders>
+              <w:top w:val="single" w:color="999999" w:sz="1"/>
+              <w:left w:val="single" w:color="999999" w:sz="1"/>
+              <w:bottom w:val="single" w:color="999999" w:sz="1"/>
+              <w:right w:val="single" w:color="999999" w:sz="1"/>
+            </w:tcBorders>
+          </w:tcPr>
+          <w:p>
+            <w:pPr>
+              <w:spacing w:after="40" w:before="40"/>
+            </w:pPr>
+            <w:r>
+              <w:rPr>
+                <w:rFonts w:ascii="Times New Roman" w:cs="Times New Roman" w:eastAsia="Times New Roman" w:hAnsi="Times New Roman"/>
+                <w:b w:val="false"/>
+                <w:bCs w:val="false"/>
+                <w:sz w:val="22"/>
+                <w:szCs w:val="22"/>
+              </w:rPr>
+              <w:t xml:space="preserve"/>
+            </w:r>
+          </w:p>
+        </w:tc>
+        <w:tc>
+          <w:tcPr>
+            <w:tcW w:type="dxa" w:w="2340"/>
+            <w:tcBorders>
+              <w:top w:val="single" w:color="999999" w:sz="1"/>
+              <w:left w:val="single" w:color="999999" w:sz="1"/>
+              <w:bottom w:val="single" w:color="999999" w:sz="1"/>
+              <w:right w:val="single" w:color="999999" w:sz="1"/>
+            </w:tcBorders>
+          </w:tcPr>
+          <w:p>
+            <w:pPr>
+              <w:spacing w:after="40" w:before="40"/>
+            </w:pPr>
+            <w:r>
+              <w:rPr>
+                <w:rFonts w:ascii="Times New Roman" w:cs="Times New Roman" w:eastAsia="Times New Roman" w:hAnsi="Times New Roman"/>
+                <w:b w:val="false"/>
+                <w:bCs w:val="false"/>
+                <w:sz w:val="22"/>
+                <w:szCs w:val="22"/>
+              </w:rPr>
+              <w:t xml:space="preserve"/>
+            </w:r>
+          </w:p>
+        </w:tc>
+        <w:tc>
+          <w:tcPr>
+            <w:tcW w:type="dxa" w:w="2340"/>
+            <w:tcBorders>
+              <w:top w:val="single" w:color="999999" w:sz="1"/>
+              <w:left w:val="single" w:color="999999" w:sz="1"/>
+              <w:bottom w:val="single" w:color="999999" w:sz="1"/>
+              <w:right w:val="single" w:color="999999" w:sz="1"/>
+            </w:tcBorders>
+          </w:tcPr>
+          <w:p>
+            <w:pPr>
+              <w:spacing w:after="40" w:before="40"/>
+            </w:pPr>
+            <w:r>
+              <w:rPr>
+                <w:rFonts w:ascii="Times New Roman" w:cs="Times New Roman" w:eastAsia="Times New Roman" w:hAnsi="Times New Roman"/>
+                <w:b w:val="false"/>
+                <w:bCs w:val="false"/>
+                <w:sz w:val="22"/>
+                <w:szCs w:val="22"/>
+              </w:rPr>
+              <w:t xml:space="preserve"/>
+            </w:r>
+          </w:p>
+        </w:tc>
+        <w:tc>
+          <w:tcPr>
+            <w:tcW w:type="dxa" w:w="2340"/>
+            <w:tcBorders>
+              <w:top w:val="single" w:color="999999" w:sz="1"/>
+              <w:left w:val="single" w:color="999999" w:sz="1"/>
+              <w:bottom w:val="single" w:color="999999" w:sz="1"/>
+              <w:right w:val="single" w:color="999999" w:sz="1"/>
+            </w:tcBorders>
+          </w:tcPr>
+          <w:p>
+            <w:pPr>
+              <w:spacing w:after="40" w:before="40"/>
+            </w:pPr>
+            <w:r>
+              <w:rPr>
+                <w:rFonts w:ascii="Times New Roman" w:cs="Times New Roman" w:eastAsia="Times New Roman" w:hAnsi="Times New Roman"/>
+                <w:b w:val="false"/>
+                <w:bCs w:val="false"/>
+                <w:sz w:val="22"/>
+                <w:szCs w:val="22"/>
+              </w:rPr>
+              <w:t xml:space="preserve">11 hình đã chụp/vẽ</w:t>
+            </w:r>
+          </w:p>
+        </w:tc>
+      </w:tr>
+      <w:tr>
+        <w:trPr>
+          <w:tblHeader w:val="false"/>
+        </w:trPr>
+        <w:tc>
+          <w:tcPr>
+            <w:tcW w:type="dxa" w:w="2340"/>
+            <w:tcBorders>
+              <w:top w:val="single" w:color="999999" w:sz="1"/>
+              <w:left w:val="single" w:color="999999" w:sz="1"/>
+              <w:bottom w:val="single" w:color="999999" w:sz="1"/>
+              <w:right w:val="single" w:color="999999" w:sz="1"/>
+            </w:tcBorders>
+          </w:tcPr>
+          <w:p>
+            <w:pPr>
+              <w:spacing w:after="40" w:before="40"/>
+            </w:pPr>
+            <w:r>
+              <w:rPr>
+                <w:rFonts w:ascii="Times New Roman" w:cs="Times New Roman" w:eastAsia="Times New Roman" w:hAnsi="Times New Roman"/>
+                <w:b w:val="false"/>
+                <w:bCs w:val="false"/>
+                <w:sz w:val="22"/>
+                <w:szCs w:val="22"/>
+              </w:rPr>
+              <w:t xml:space="preserve"/>
+            </w:r>
+          </w:p>
+        </w:tc>
+        <w:tc>
+          <w:tcPr>
+            <w:tcW w:type="dxa" w:w="2340"/>
+            <w:tcBorders>
+              <w:top w:val="single" w:color="999999" w:sz="1"/>
+              <w:left w:val="single" w:color="999999" w:sz="1"/>
+              <w:bottom w:val="single" w:color="999999" w:sz="1"/>
+              <w:right w:val="single" w:color="999999" w:sz="1"/>
+            </w:tcBorders>
+          </w:tcPr>
+          <w:p>
+            <w:pPr>
+              <w:spacing w:after="40" w:before="40"/>
+            </w:pPr>
+            <w:r>
+              <w:rPr>
+                <w:rFonts w:ascii="Times New Roman" w:cs="Times New Roman" w:eastAsia="Times New Roman" w:hAnsi="Times New Roman"/>
+                <w:b w:val="false"/>
+                <w:bCs w:val="false"/>
+                <w:sz w:val="22"/>
+                <w:szCs w:val="22"/>
+              </w:rPr>
+              <w:t xml:space="preserve"/>
+            </w:r>
+          </w:p>
+        </w:tc>
+        <w:tc>
+          <w:tcPr>
+            <w:tcW w:type="dxa" w:w="2340"/>
+            <w:tcBorders>
+              <w:top w:val="single" w:color="999999" w:sz="1"/>
+              <w:left w:val="single" w:color="999999" w:sz="1"/>
+              <w:bottom w:val="single" w:color="999999" w:sz="1"/>
+              <w:right w:val="single" w:color="999999" w:sz="1"/>
+            </w:tcBorders>
+          </w:tcPr>
+          <w:p>
+            <w:pPr>
+              <w:spacing w:after="40" w:before="40"/>
+            </w:pPr>
+            <w:r>
+              <w:rPr>
+                <w:rFonts w:ascii="Times New Roman" w:cs="Times New Roman" w:eastAsia="Times New Roman" w:hAnsi="Times New Roman"/>
+                <w:b w:val="false"/>
+                <w:bCs w:val="false"/>
+                <w:sz w:val="22"/>
+                <w:szCs w:val="22"/>
+              </w:rPr>
+              <w:t xml:space="preserve"/>
+            </w:r>
+          </w:p>
+        </w:tc>
+        <w:tc>
+          <w:tcPr>
+            <w:tcW w:type="dxa" w:w="2340"/>
+            <w:tcBorders>
+              <w:top w:val="single" w:color="999999" w:sz="1"/>
+              <w:left w:val="single" w:color="999999" w:sz="1"/>
+              <w:bottom w:val="single" w:color="999999" w:sz="1"/>
+              <w:right w:val="single" w:color="999999" w:sz="1"/>
+            </w:tcBorders>
+          </w:tcPr>
+          <w:p>
+            <w:pPr>
+              <w:spacing w:after="40" w:before="40"/>
+            </w:pPr>
+            <w:r>
+              <w:rPr>
+                <w:rFonts w:ascii="Times New Roman" w:cs="Times New Roman" w:eastAsia="Times New Roman" w:hAnsi="Times New Roman"/>
+                <w:b w:val="false"/>
+                <w:bCs w:val="false"/>
+                <w:sz w:val="22"/>
+                <w:szCs w:val="22"/>
+              </w:rPr>
+              <w:t xml:space="preserve">Slide: chưa</w:t>
             </w:r>
           </w:p>
         </w:tc>
@@ -2250,7 +2795,46 @@
           <w:sz w:val="26"/>
           <w:szCs w:val="26"/>
         </w:rPr>
-        <w:t xml:space="preserve">Nhận xét: Backend, Dashboard và tích hợp E2E đã hoàn thành sớm hơn kế hoạch (tuần 3 thay vì tuần 11-15). Hai phần còn thiếu là luật đếm xe theo hướng và đánh giá OCR toàn diện.</w:t>
+        <w:t xml:space="preserve">Nhận xét: Backend (tuần 11-12) và Dashboard (tuần 13-14) hoàn thành sớm hơn kế hoạch.</w:t>
+      </w:r>
+    </w:p>
+    <w:p>
+      <w:pPr>
+        <w:spacing w:after="60" w:before="60"/>
+      </w:pPr>
+      <w:r>
+        <w:rPr>
+          <w:rFonts w:ascii="Times New Roman" w:cs="Times New Roman" w:eastAsia="Times New Roman" w:hAnsi="Times New Roman"/>
+          <w:sz w:val="26"/>
+          <w:szCs w:val="26"/>
+        </w:rPr>
+        <w:t xml:space="preserve">Tích hợp E2E hoạt động: video → AI detect → gửi backend → hiển thị dashboard.</w:t>
+      </w:r>
+    </w:p>
+    <w:p>
+      <w:pPr>
+        <w:spacing w:after="60" w:before="60"/>
+      </w:pPr>
+      <w:r>
+        <w:rPr>
+          <w:rFonts w:ascii="Times New Roman" w:cs="Times New Roman" w:eastAsia="Times New Roman" w:hAnsi="Times New Roman"/>
+          <w:sz w:val="26"/>
+          <w:szCs w:val="26"/>
+        </w:rPr>
+        <w:t xml:space="preserve">Còn cần: đếm xe theo camera direction, full OCR eval, test dashboard kỹ hơn, slide bảo vệ.</w:t>
+      </w:r>
+    </w:p>
+    <w:p>
+      <w:pPr>
+        <w:spacing w:after="60" w:before="60"/>
+      </w:pPr>
+      <w:r>
+        <w:rPr>
+          <w:rFonts w:ascii="Times New Roman" w:cs="Times New Roman" w:eastAsia="Times New Roman" w:hAnsi="Times New Roman"/>
+          <w:sz w:val="26"/>
+          <w:szCs w:val="26"/>
+        </w:rPr>
+        <w:t xml:space="preserve">Cập nhật lần cuối: 14/04/2026, dựa trên test logs tại test_plans_and_reports/.</w:t>
       </w:r>
     </w:p>
     <w:p>
@@ -11144,7 +11728,7 @@
           <w:sz w:val="24"/>
           <w:szCs w:val="24"/>
         </w:rPr>
-        <w:t xml:space="preserve">Tổng frame:        300 (30 giây)</w:t>
+        <w:t xml:space="preserve">Lần 1 — 300 frames (toàn bộ video, 30 giây):</w:t>
       </w:r>
     </w:p>
     <w:p>
@@ -11186,7 +11770,7 @@
           <w:sz w:val="24"/>
           <w:szCs w:val="24"/>
         </w:rPr>
-        <w:t xml:space="preserve">FPS trên CPU:       2.1 (chậm, cần GPU)</w:t>
+        <w:t xml:space="preserve">FPS trên CPU:       2.1</w:t>
       </w:r>
     </w:p>
     <w:p>
@@ -11200,7 +11784,105 @@
           <w:sz w:val="24"/>
           <w:szCs w:val="24"/>
         </w:rPr>
-        <w:t xml:space="preserve">Thời gian xử lý:   140 giây cho 30 giây video</w:t>
+        <w:t xml:space="preserve">Thời gian xử lý:   140 giây</w:t>
+      </w:r>
+    </w:p>
+    <w:p>
+      <w:pPr>
+        <w:spacing w:after="20" w:before="20"/>
+        <w:ind w:left="360"/>
+      </w:pPr>
+      <w:r>
+        <w:rPr>
+          <w:rFonts w:ascii="Times New Roman" w:cs="Times New Roman" w:eastAsia="Times New Roman" w:hAnsi="Times New Roman"/>
+          <w:sz w:val="24"/>
+          <w:szCs w:val="24"/>
+        </w:rPr>
+        <w:t xml:space="preserve">Lần 2 — 101 frames (test có logging, 14/04/2026):</w:t>
+      </w:r>
+    </w:p>
+    <w:p>
+      <w:pPr>
+        <w:spacing w:after="20" w:before="20"/>
+        <w:ind w:left="360"/>
+      </w:pPr>
+      <w:r>
+        <w:rPr>
+          <w:rFonts w:ascii="Times New Roman" w:cs="Times New Roman" w:eastAsia="Times New Roman" w:hAnsi="Times New Roman"/>
+          <w:sz w:val="24"/>
+          <w:szCs w:val="24"/>
+        </w:rPr>
+        <w:t xml:space="preserve">Biển số phát hiện:  1 biển unique (36H82613)</w:t>
+      </w:r>
+    </w:p>
+    <w:p>
+      <w:pPr>
+        <w:spacing w:after="20" w:before="20"/>
+        <w:ind w:left="360"/>
+      </w:pPr>
+      <w:r>
+        <w:rPr>
+          <w:rFonts w:ascii="Times New Roman" w:cs="Times New Roman" w:eastAsia="Times New Roman" w:hAnsi="Times New Roman"/>
+          <w:sz w:val="24"/>
+          <w:szCs w:val="24"/>
+        </w:rPr>
+        <w:t xml:space="preserve">Events gửi backend: 6 raw events, 2 unique sent (2 track IDs)</w:t>
+      </w:r>
+    </w:p>
+    <w:p>
+      <w:pPr>
+        <w:spacing w:after="20" w:before="20"/>
+        <w:ind w:left="360"/>
+      </w:pPr>
+      <w:r>
+        <w:rPr>
+          <w:rFonts w:ascii="Times New Roman" w:cs="Times New Roman" w:eastAsia="Times New Roman" w:hAnsi="Times New Roman"/>
+          <w:sz w:val="24"/>
+          <w:szCs w:val="24"/>
+        </w:rPr>
+        <w:t xml:space="preserve">FPS trên CPU:       1.6</w:t>
+      </w:r>
+    </w:p>
+    <w:p>
+      <w:pPr>
+        <w:spacing w:after="20" w:before="20"/>
+        <w:ind w:left="360"/>
+      </w:pPr>
+      <w:r>
+        <w:rPr>
+          <w:rFonts w:ascii="Times New Roman" w:cs="Times New Roman" w:eastAsia="Times New Roman" w:hAnsi="Times New Roman"/>
+          <w:sz w:val="24"/>
+          <w:szCs w:val="24"/>
+        </w:rPr>
+        <w:t xml:space="preserve">Thời gian xử lý:   62.1 giây</w:t>
+      </w:r>
+    </w:p>
+    <w:p>
+      <w:pPr>
+        <w:spacing w:after="20" w:before="20"/>
+        <w:ind w:left="360"/>
+      </w:pPr>
+      <w:r>
+        <w:rPr>
+          <w:rFonts w:ascii="Times New Roman" w:cs="Times New Roman" w:eastAsia="Times New Roman" w:hAnsi="Times New Roman"/>
+          <w:sz w:val="24"/>
+          <w:szCs w:val="24"/>
+        </w:rPr>
+        <w:t xml:space="preserve">Vehicle type:       consistent (car), không có mismatch lần này</w:t>
+      </w:r>
+    </w:p>
+    <w:p>
+      <w:pPr>
+        <w:spacing w:after="20" w:before="20"/>
+        <w:ind w:left="360"/>
+      </w:pPr>
+      <w:r>
+        <w:rPr>
+          <w:rFonts w:ascii="Times New Roman" w:cs="Times New Roman" w:eastAsia="Times New Roman" w:hAnsi="Times New Roman"/>
+          <w:sz w:val="24"/>
+          <w:szCs w:val="24"/>
+        </w:rPr>
+        <w:t xml:space="preserve">Duplicate:          1 biển có 2 events (do SORT tạo track mới)</w:t>
       </w:r>
     </w:p>
     <w:p>
@@ -11291,7 +11973,7 @@
           <w:sz w:val="24"/>
           <w:szCs w:val="24"/>
         </w:rPr>
-        <w:t xml:space="preserve">Unit tests:        56/56 pass (100%)</w:t>
+        <w:t xml:space="preserve">Unit tests:        56/56 pass (100%), 1.69 giây (14/04/2026)</w:t>
       </w:r>
     </w:p>
     <w:p>
@@ -11305,7 +11987,7 @@
           <w:sz w:val="24"/>
           <w:szCs w:val="24"/>
         </w:rPr>
-        <w:t xml:space="preserve">Thời gian test:    1.62 giây</w:t>
+        <w:t xml:space="preserve">API smoke test:    5/5 pass (health, POST event, GET events/accounts/stats)</w:t>
       </w:r>
     </w:p>
     <w:p>
@@ -11319,7 +12001,7 @@
           <w:sz w:val="24"/>
           <w:szCs w:val="24"/>
         </w:rPr>
-        <w:t xml:space="preserve">API smoke test:    Health, POST event, GET accounts — all pass</w:t>
+        <w:t xml:space="preserve">Dashboard API:     7/7 pass (events, stats, accounts, detail, barrier, traffic, OCR rate)</w:t>
       </w:r>
     </w:p>
     <w:p>
@@ -11334,6 +12016,34 @@
           <w:szCs w:val="24"/>
         </w:rPr>
         <w:t xml:space="preserve">Barrier logic:     8 test cases covering 6 nhánh — all pass</w:t>
+      </w:r>
+    </w:p>
+    <w:p>
+      <w:pPr>
+        <w:spacing w:after="20" w:before="20"/>
+        <w:ind w:left="360"/>
+      </w:pPr>
+      <w:r>
+        <w:rPr>
+          <w:rFonts w:ascii="Times New Roman" w:cs="Times New Roman" w:eastAsia="Times New Roman" w:hAnsi="Times New Roman"/>
+          <w:sz w:val="24"/>
+          <w:szCs w:val="24"/>
+        </w:rPr>
+        <w:t xml:space="preserve">Chi tiết log:      test_plans_and_reports/test2-api-manual-log.txt</w:t>
+      </w:r>
+    </w:p>
+    <w:p>
+      <w:pPr>
+        <w:spacing w:after="20" w:before="20"/>
+        <w:ind w:left="360"/>
+      </w:pPr>
+      <w:r>
+        <w:rPr>
+          <w:rFonts w:ascii="Times New Roman" w:cs="Times New Roman" w:eastAsia="Times New Roman" w:hAnsi="Times New Roman"/>
+          <w:sz w:val="24"/>
+          <w:szCs w:val="24"/>
+        </w:rPr>
+        <w:t xml:space="preserve">test_plans_and_reports/test3-dashboard-api-log.txt</w:t>
       </w:r>
     </w:p>
     <w:p>
@@ -12101,7 +12811,7 @@
                 <w:sz w:val="22"/>
                 <w:szCs w:val="22"/>
               </w:rPr>
-              <w:t xml:space="preserve">67</w:t>
+              <w:t xml:space="preserve">74</w:t>
             </w:r>
           </w:p>
         </w:tc>
@@ -12899,7 +13609,7 @@
                 <w:sz w:val="22"/>
                 <w:szCs w:val="22"/>
               </w:rPr>
-              <w:t xml:space="preserve">2.1</w:t>
+              <w:t xml:space="preserve">1.6–2.1</w:t>
             </w:r>
           </w:p>
         </w:tc>
@@ -12956,7 +13666,7 @@
                 <w:sz w:val="22"/>
                 <w:szCs w:val="22"/>
               </w:rPr>
-              <w:t xml:space="preserve">1.62s</w:t>
+              <w:t xml:space="preserve">1.69s</w:t>
             </w:r>
           </w:p>
         </w:tc>

</xml_diff>

<commit_message>
docs: match docx styles to reference bao_cao_de_xuat_de_tai_v1.docx
Extracted styles from reference via OOXML unpack:
- Margins: top=2.5cm, bottom=2.2cm, left=3.0cm, right=2.2cm
- Line spacing: 276 (1.15 lines)
- Heading 1: 14pt bold, before=480
- Heading 3: 12pt bold (no italic)
- Title: 18pt bold
- Footer: "Trang X" format
</commit_message>
<xml_diff>
--- a/reports/2026-04-13/docx/bao-cao.docx
+++ b/reports/2026-04-13/docx/bao-cao.docx
@@ -12,8 +12,8 @@
           <w:rFonts w:ascii="Times New Roman" w:cs="Times New Roman" w:eastAsia="Times New Roman" w:hAnsi="Times New Roman"/>
           <w:b/>
           <w:bCs/>
-          <w:sz w:val="32"/>
-          <w:szCs w:val="32"/>
+          <w:sz w:val="36"/>
+          <w:szCs w:val="36"/>
         </w:rPr>
         <w:t xml:space="preserve">BÁO CÁO ĐỊNH KỲ TIẾN ĐỘ ĐỒ ÁN TỐT NGHIỆP</w:t>
       </w:r>
@@ -41,8 +41,8 @@
           <w:rFonts w:ascii="Times New Roman" w:cs="Times New Roman" w:eastAsia="Times New Roman" w:hAnsi="Times New Roman"/>
           <w:b/>
           <w:bCs/>
-          <w:sz w:val="32"/>
-          <w:szCs w:val="32"/>
+          <w:sz w:val="36"/>
+          <w:szCs w:val="36"/>
         </w:rPr>
         <w:t xml:space="preserve">CƠ SỞ GIÁO DỤC ĐÀO TẠO THÔNG QUA NHẬN DIỆN BIỂN SỐ XE</w:t>
       </w:r>
@@ -18546,7 +18546,7 @@
       <w:headerReference w:type="default" r:id="rId7"/>
       <w:footerReference w:type="default" r:id="rId8"/>
       <w:pgSz w:w="11906" w:h="16838" w:orient="portrait"/>
-      <w:pgMar w:top="1440" w:right="1134" w:bottom="1440" w:left="1701" w:header="708" w:footer="708" w:gutter="0"/>
+      <w:pgMar w:top="1417" w:right="1247" w:bottom="1247" w:left="1701" w:header="708" w:footer="708" w:gutter="0"/>
       <w:pgNumType/>
       <w:docGrid w:linePitch="360"/>
     </w:sectPr>
@@ -18601,6 +18601,14 @@
     <w:pPr>
       <w:jc w:val="center"/>
     </w:pPr>
+    <w:r>
+      <w:rPr>
+        <w:rFonts w:ascii="Times New Roman" w:cs="Times New Roman" w:eastAsia="Times New Roman" w:hAnsi="Times New Roman"/>
+        <w:sz w:val="20"/>
+        <w:szCs w:val="20"/>
+      </w:rPr>
+      <w:t xml:space="preserve">Trang </w:t>
+    </w:r>
     <w:r>
       <w:rPr>
         <w:rFonts w:ascii="Times New Roman" w:cs="Times New Roman" w:eastAsia="Times New Roman" w:hAnsi="Times New Roman"/>
@@ -18796,7 +18804,11 @@
         <w:szCs w:val="26"/>
       </w:rPr>
     </w:rPrDefault>
-    <w:pPrDefault/>
+    <w:pPrDefault>
+      <w:pPr>
+        <w:spacing w:line="276"/>
+      </w:pPr>
+    </w:pPrDefault>
   </w:docDefaults>
   <w:style w:type="paragraph" w:styleId="Title">
     <w:name w:val="Title"/>
@@ -18975,7 +18987,7 @@
     <w:next w:val="Normal"/>
     <w:qFormat/>
     <w:pPr>
-      <w:spacing w:after="240" w:before="360"/>
+      <w:spacing w:after="0" w:before="480"/>
       <w:outlineLvl w:val="0"/>
     </w:pPr>
     <w:rPr>
@@ -19009,17 +19021,15 @@
     <w:next w:val="Normal"/>
     <w:qFormat/>
     <w:pPr>
-      <w:spacing w:after="100" w:before="200"/>
+      <w:spacing w:after="0" w:before="200"/>
       <w:outlineLvl w:val="2"/>
     </w:pPr>
     <w:rPr>
       <w:rFonts w:ascii="Times New Roman" w:cs="Times New Roman" w:eastAsia="Times New Roman" w:hAnsi="Times New Roman"/>
       <w:b/>
       <w:bCs/>
-      <w:i/>
-      <w:iCs/>
-      <w:sz w:val="26"/>
-      <w:szCs w:val="26"/>
+      <w:sz w:val="24"/>
+      <w:szCs w:val="24"/>
     </w:rPr>
   </w:style>
 </w:styles>

</xml_diff>